<commit_message>
Store canonical 10-minute sensor means
</commit_message>
<xml_diff>
--- a/docs/Deliverables/Data Dictionary.docx
+++ b/docs/Deliverables/Data Dictionary.docx
@@ -6432,8 +6432,8 @@
           </w:tblCellMar>
         </w:tblPrEx>
         <w:trPr>
+          <w:tblHeader/>
           <w:cantSplit/>
-          <w:tblHeader/>
         </w:trPr>
         <w:tc>
           <w:tcPr>
@@ -6822,19 +6822,8 @@
             <w:tcW w:w="1458" w:type="dxa"/>
           </w:tcPr>
           <w:p>
-            <w:pPr>
-              <w:widowControl w:val="0"/>
-              <w:spacing w:after="0" w:line="240" w:lineRule="auto"/>
-              <w:jc w:val="left"/>
-              <w:rPr>
-                <w:rFonts w:hint="default" w:ascii="Arial" w:hAnsi="Arial" w:cs="Arial"/>
-              </w:rPr>
-            </w:pPr>
-            <w:r>
-              <w:rPr>
-                <w:rFonts w:hint="default" w:ascii="Arial" w:hAnsi="Arial" w:cs="Arial"/>
-              </w:rPr>
-              <w:t>temp_min</w:t>
+            <w:r>
+              <w:t>temperature</w:t>
             </w:r>
           </w:p>
         </w:tc>
@@ -6843,18 +6832,7 @@
             <w:tcW w:w="1350" w:type="dxa"/>
           </w:tcPr>
           <w:p>
-            <w:pPr>
-              <w:widowControl w:val="0"/>
-              <w:spacing w:after="0" w:line="240" w:lineRule="auto"/>
-              <w:jc w:val="left"/>
-              <w:rPr>
-                <w:rFonts w:hint="default" w:ascii="Arial" w:hAnsi="Arial" w:cs="Arial"/>
-              </w:rPr>
-            </w:pPr>
-            <w:r>
-              <w:rPr>
-                <w:rFonts w:hint="default" w:ascii="Arial" w:hAnsi="Arial" w:cs="Arial"/>
-              </w:rPr>
+            <w:r>
               <w:t>decimal(6,2)</w:t>
             </w:r>
           </w:p>
@@ -6864,18 +6842,7 @@
             <w:tcW w:w="1656" w:type="dxa"/>
           </w:tcPr>
           <w:p>
-            <w:pPr>
-              <w:widowControl w:val="0"/>
-              <w:spacing w:after="0" w:line="240" w:lineRule="auto"/>
-              <w:jc w:val="left"/>
-              <w:rPr>
-                <w:rFonts w:hint="default" w:ascii="Arial" w:hAnsi="Arial" w:cs="Arial"/>
-              </w:rPr>
-            </w:pPr>
-            <w:r>
-              <w:rPr>
-                <w:rFonts w:hint="default" w:ascii="Arial" w:hAnsi="Arial" w:cs="Arial"/>
-              </w:rPr>
+            <w:r>
               <w:t>Optional</w:t>
             </w:r>
           </w:p>
@@ -6885,19 +6852,8 @@
             <w:tcW w:w="1656" w:type="dxa"/>
           </w:tcPr>
           <w:p>
-            <w:pPr>
-              <w:widowControl w:val="0"/>
-              <w:spacing w:after="0" w:line="240" w:lineRule="auto"/>
-              <w:jc w:val="left"/>
-              <w:rPr>
-                <w:rFonts w:hint="default" w:ascii="Arial" w:hAnsi="Arial" w:cs="Arial"/>
-              </w:rPr>
-            </w:pPr>
-            <w:r>
-              <w:rPr>
-                <w:rFonts w:hint="default" w:ascii="Arial" w:hAnsi="Arial" w:cs="Arial"/>
-              </w:rPr>
-              <w:t>27</w:t>
+            <w:r>
+              <w:t>27.4</w:t>
             </w:r>
           </w:p>
         </w:tc>
@@ -6906,19 +6862,8 @@
             <w:tcW w:w="2808" w:type="dxa"/>
           </w:tcPr>
           <w:p>
-            <w:pPr>
-              <w:widowControl w:val="0"/>
-              <w:spacing w:after="0" w:line="240" w:lineRule="auto"/>
-              <w:jc w:val="left"/>
-              <w:rPr>
-                <w:rFonts w:hint="default" w:ascii="Arial" w:hAnsi="Arial" w:cs="Arial"/>
-              </w:rPr>
-            </w:pPr>
-            <w:r>
-              <w:rPr>
-                <w:rFonts w:hint="default" w:ascii="Arial" w:hAnsi="Arial" w:cs="Arial"/>
-              </w:rPr>
-              <w:t>Records the lowest water temperature in degrees Celsius during the measurement interval.</w:t>
+            <w:r>
+              <w:t>Stores the mean of valid temperature readings collected during this 10-minute window, in degrees Celsius.</w:t>
             </w:r>
           </w:p>
         </w:tc>
@@ -6948,19 +6893,8 @@
             <w:tcW w:w="1458" w:type="dxa"/>
           </w:tcPr>
           <w:p>
-            <w:pPr>
-              <w:widowControl w:val="0"/>
-              <w:spacing w:after="0" w:line="240" w:lineRule="auto"/>
-              <w:jc w:val="left"/>
-              <w:rPr>
-                <w:rFonts w:hint="default" w:ascii="Arial" w:hAnsi="Arial" w:cs="Arial"/>
-              </w:rPr>
-            </w:pPr>
-            <w:r>
-              <w:rPr>
-                <w:rFonts w:hint="default" w:ascii="Arial" w:hAnsi="Arial" w:cs="Arial"/>
-              </w:rPr>
-              <w:t>temp_max</w:t>
+            <w:r>
+              <w:t>ph_level</w:t>
             </w:r>
           </w:p>
         </w:tc>
@@ -6969,39 +6903,17 @@
             <w:tcW w:w="1350" w:type="dxa"/>
           </w:tcPr>
           <w:p>
-            <w:pPr>
-              <w:widowControl w:val="0"/>
-              <w:spacing w:after="0" w:line="240" w:lineRule="auto"/>
-              <w:jc w:val="left"/>
-              <w:rPr>
-                <w:rFonts w:hint="default" w:ascii="Arial" w:hAnsi="Arial" w:cs="Arial"/>
-              </w:rPr>
-            </w:pPr>
-            <w:r>
-              <w:rPr>
-                <w:rFonts w:hint="default" w:ascii="Arial" w:hAnsi="Arial" w:cs="Arial"/>
-              </w:rPr>
-              <w:t>decimal(6,2)</w:t>
-            </w:r>
-          </w:p>
-        </w:tc>
-        <w:tc>
-          <w:tcPr>
-            <w:tcW w:w="1656" w:type="dxa"/>
-          </w:tcPr>
-          <w:p>
-            <w:pPr>
-              <w:widowControl w:val="0"/>
-              <w:spacing w:after="0" w:line="240" w:lineRule="auto"/>
-              <w:jc w:val="left"/>
-              <w:rPr>
-                <w:rFonts w:hint="default" w:ascii="Arial" w:hAnsi="Arial" w:cs="Arial"/>
-              </w:rPr>
-            </w:pPr>
-            <w:r>
-              <w:rPr>
-                <w:rFonts w:hint="default" w:ascii="Arial" w:hAnsi="Arial" w:cs="Arial"/>
-              </w:rPr>
+            <w:r>
+              <w:t>decimal(5,2)</w:t>
+            </w:r>
+          </w:p>
+        </w:tc>
+        <w:tc>
+          <w:tcPr>
+            <w:tcW w:w="1656" w:type="dxa"/>
+          </w:tcPr>
+          <w:p>
+            <w:r>
               <w:t>Optional</w:t>
             </w:r>
           </w:p>
@@ -7011,19 +6923,8 @@
             <w:tcW w:w="1656" w:type="dxa"/>
           </w:tcPr>
           <w:p>
-            <w:pPr>
-              <w:widowControl w:val="0"/>
-              <w:spacing w:after="0" w:line="240" w:lineRule="auto"/>
-              <w:jc w:val="left"/>
-              <w:rPr>
-                <w:rFonts w:hint="default" w:ascii="Arial" w:hAnsi="Arial" w:cs="Arial"/>
-              </w:rPr>
-            </w:pPr>
-            <w:r>
-              <w:rPr>
-                <w:rFonts w:hint="default" w:ascii="Arial" w:hAnsi="Arial" w:cs="Arial"/>
-              </w:rPr>
-              <w:t>28</w:t>
+            <w:r>
+              <w:t>7.30</w:t>
             </w:r>
           </w:p>
         </w:tc>
@@ -7032,19 +6933,8 @@
             <w:tcW w:w="2808" w:type="dxa"/>
           </w:tcPr>
           <w:p>
-            <w:pPr>
-              <w:widowControl w:val="0"/>
-              <w:spacing w:after="0" w:line="240" w:lineRule="auto"/>
-              <w:jc w:val="left"/>
-              <w:rPr>
-                <w:rFonts w:hint="default" w:ascii="Arial" w:hAnsi="Arial" w:cs="Arial"/>
-              </w:rPr>
-            </w:pPr>
-            <w:r>
-              <w:rPr>
-                <w:rFonts w:hint="default" w:ascii="Arial" w:hAnsi="Arial" w:cs="Arial"/>
-              </w:rPr>
-              <w:t>Records the highest water temperature in degrees Celsius during the measurement interval.</w:t>
+            <w:r>
+              <w:t>Stores the mean of valid pH readings collected during this 10-minute window.</w:t>
             </w:r>
           </w:p>
         </w:tc>
@@ -7074,19 +6964,8 @@
             <w:tcW w:w="1458" w:type="dxa"/>
           </w:tcPr>
           <w:p>
-            <w:pPr>
-              <w:widowControl w:val="0"/>
-              <w:spacing w:after="0" w:line="240" w:lineRule="auto"/>
-              <w:jc w:val="left"/>
-              <w:rPr>
-                <w:rFonts w:hint="default" w:ascii="Arial" w:hAnsi="Arial" w:cs="Arial"/>
-              </w:rPr>
-            </w:pPr>
-            <w:r>
-              <w:rPr>
-                <w:rFonts w:hint="default" w:ascii="Arial" w:hAnsi="Arial" w:cs="Arial"/>
-              </w:rPr>
-              <w:t>temp_avg</w:t>
+            <w:r>
+              <w:t>dissolved_oxygen</w:t>
             </w:r>
           </w:p>
         </w:tc>
@@ -7095,39 +6974,17 @@
             <w:tcW w:w="1350" w:type="dxa"/>
           </w:tcPr>
           <w:p>
-            <w:pPr>
-              <w:widowControl w:val="0"/>
-              <w:spacing w:after="0" w:line="240" w:lineRule="auto"/>
-              <w:jc w:val="left"/>
-              <w:rPr>
-                <w:rFonts w:hint="default" w:ascii="Arial" w:hAnsi="Arial" w:cs="Arial"/>
-              </w:rPr>
-            </w:pPr>
-            <w:r>
-              <w:rPr>
-                <w:rFonts w:hint="default" w:ascii="Arial" w:hAnsi="Arial" w:cs="Arial"/>
-              </w:rPr>
-              <w:t>decimal(6,2)</w:t>
-            </w:r>
-          </w:p>
-        </w:tc>
-        <w:tc>
-          <w:tcPr>
-            <w:tcW w:w="1656" w:type="dxa"/>
-          </w:tcPr>
-          <w:p>
-            <w:pPr>
-              <w:widowControl w:val="0"/>
-              <w:spacing w:after="0" w:line="240" w:lineRule="auto"/>
-              <w:jc w:val="left"/>
-              <w:rPr>
-                <w:rFonts w:hint="default" w:ascii="Arial" w:hAnsi="Arial" w:cs="Arial"/>
-              </w:rPr>
-            </w:pPr>
-            <w:r>
-              <w:rPr>
-                <w:rFonts w:hint="default" w:ascii="Arial" w:hAnsi="Arial" w:cs="Arial"/>
-              </w:rPr>
+            <w:r>
+              <w:t>decimal(5,2)</w:t>
+            </w:r>
+          </w:p>
+        </w:tc>
+        <w:tc>
+          <w:tcPr>
+            <w:tcW w:w="1656" w:type="dxa"/>
+          </w:tcPr>
+          <w:p>
+            <w:r>
               <w:t>Optional</w:t>
             </w:r>
           </w:p>
@@ -7137,19 +6994,8 @@
             <w:tcW w:w="1656" w:type="dxa"/>
           </w:tcPr>
           <w:p>
-            <w:pPr>
-              <w:widowControl w:val="0"/>
-              <w:spacing w:after="0" w:line="240" w:lineRule="auto"/>
-              <w:jc w:val="left"/>
-              <w:rPr>
-                <w:rFonts w:hint="default" w:ascii="Arial" w:hAnsi="Arial" w:cs="Arial"/>
-              </w:rPr>
-            </w:pPr>
-            <w:r>
-              <w:rPr>
-                <w:rFonts w:hint="default" w:ascii="Arial" w:hAnsi="Arial" w:cs="Arial"/>
-              </w:rPr>
-              <w:t>27</w:t>
+            <w:r>
+              <w:t>5.80</w:t>
             </w:r>
           </w:p>
         </w:tc>
@@ -7158,19 +7004,8 @@
             <w:tcW w:w="2808" w:type="dxa"/>
           </w:tcPr>
           <w:p>
-            <w:pPr>
-              <w:widowControl w:val="0"/>
-              <w:spacing w:after="0" w:line="240" w:lineRule="auto"/>
-              <w:jc w:val="left"/>
-              <w:rPr>
-                <w:rFonts w:hint="default" w:ascii="Arial" w:hAnsi="Arial" w:cs="Arial"/>
-              </w:rPr>
-            </w:pPr>
-            <w:r>
-              <w:rPr>
-                <w:rFonts w:hint="default" w:ascii="Arial" w:hAnsi="Arial" w:cs="Arial"/>
-              </w:rPr>
-              <w:t>Records the average water temperature in degrees Celsius during the measurement interval.</w:t>
+            <w:r>
+              <w:t>Stores the mean of valid dissolved oxygen readings collected during this 10-minute window, in milligrams per liter.</w:t>
             </w:r>
           </w:p>
         </w:tc>
@@ -7200,19 +7035,8 @@
             <w:tcW w:w="1458" w:type="dxa"/>
           </w:tcPr>
           <w:p>
-            <w:pPr>
-              <w:widowControl w:val="0"/>
-              <w:spacing w:after="0" w:line="240" w:lineRule="auto"/>
-              <w:jc w:val="left"/>
-              <w:rPr>
-                <w:rFonts w:hint="default" w:ascii="Arial" w:hAnsi="Arial" w:cs="Arial"/>
-              </w:rPr>
-            </w:pPr>
-            <w:r>
-              <w:rPr>
-                <w:rFonts w:hint="default" w:ascii="Arial" w:hAnsi="Arial" w:cs="Arial"/>
-              </w:rPr>
-              <w:t>pH_min</w:t>
+            <w:r>
+              <w:t>turbidity</w:t>
             </w:r>
           </w:p>
         </w:tc>
@@ -7221,39 +7045,17 @@
             <w:tcW w:w="1350" w:type="dxa"/>
           </w:tcPr>
           <w:p>
-            <w:pPr>
-              <w:widowControl w:val="0"/>
-              <w:spacing w:after="0" w:line="240" w:lineRule="auto"/>
-              <w:jc w:val="left"/>
-              <w:rPr>
-                <w:rFonts w:hint="default" w:ascii="Arial" w:hAnsi="Arial" w:cs="Arial"/>
-              </w:rPr>
-            </w:pPr>
-            <w:r>
-              <w:rPr>
-                <w:rFonts w:hint="default" w:ascii="Arial" w:hAnsi="Arial" w:cs="Arial"/>
-              </w:rPr>
-              <w:t>decimal(5,2)</w:t>
-            </w:r>
-          </w:p>
-        </w:tc>
-        <w:tc>
-          <w:tcPr>
-            <w:tcW w:w="1656" w:type="dxa"/>
-          </w:tcPr>
-          <w:p>
-            <w:pPr>
-              <w:widowControl w:val="0"/>
-              <w:spacing w:after="0" w:line="240" w:lineRule="auto"/>
-              <w:jc w:val="left"/>
-              <w:rPr>
-                <w:rFonts w:hint="default" w:ascii="Arial" w:hAnsi="Arial" w:cs="Arial"/>
-              </w:rPr>
-            </w:pPr>
-            <w:r>
-              <w:rPr>
-                <w:rFonts w:hint="default" w:ascii="Arial" w:hAnsi="Arial" w:cs="Arial"/>
-              </w:rPr>
+            <w:r>
+              <w:t>decimal(8,2)</w:t>
+            </w:r>
+          </w:p>
+        </w:tc>
+        <w:tc>
+          <w:tcPr>
+            <w:tcW w:w="1656" w:type="dxa"/>
+          </w:tcPr>
+          <w:p>
+            <w:r>
               <w:t>Optional</w:t>
             </w:r>
           </w:p>
@@ -7263,19 +7065,8 @@
             <w:tcW w:w="1656" w:type="dxa"/>
           </w:tcPr>
           <w:p>
-            <w:pPr>
-              <w:widowControl w:val="0"/>
-              <w:spacing w:after="0" w:line="240" w:lineRule="auto"/>
-              <w:jc w:val="left"/>
-              <w:rPr>
-                <w:rFonts w:hint="default" w:ascii="Arial" w:hAnsi="Arial" w:cs="Arial"/>
-              </w:rPr>
-            </w:pPr>
-            <w:r>
-              <w:rPr>
-                <w:rFonts w:hint="default" w:ascii="Arial" w:hAnsi="Arial" w:cs="Arial"/>
-              </w:rPr>
-              <w:t>7</w:t>
+            <w:r>
+              <w:t>20.40</w:t>
             </w:r>
           </w:p>
         </w:tc>
@@ -7284,19 +7075,8 @@
             <w:tcW w:w="2808" w:type="dxa"/>
           </w:tcPr>
           <w:p>
-            <w:pPr>
-              <w:widowControl w:val="0"/>
-              <w:spacing w:after="0" w:line="240" w:lineRule="auto"/>
-              <w:jc w:val="left"/>
-              <w:rPr>
-                <w:rFonts w:hint="default" w:ascii="Arial" w:hAnsi="Arial" w:cs="Arial"/>
-              </w:rPr>
-            </w:pPr>
-            <w:r>
-              <w:rPr>
-                <w:rFonts w:hint="default" w:ascii="Arial" w:hAnsi="Arial" w:cs="Arial"/>
-              </w:rPr>
-              <w:t>Records the lowest pH value during the measurement interval.</w:t>
+            <w:r>
+              <w:t>Stores the mean of valid turbidity readings collected during this 10-minute window, in NTU.</w:t>
             </w:r>
           </w:p>
         </w:tc>
@@ -7326,19 +7106,8 @@
             <w:tcW w:w="1458" w:type="dxa"/>
           </w:tcPr>
           <w:p>
-            <w:pPr>
-              <w:widowControl w:val="0"/>
-              <w:spacing w:after="0" w:line="240" w:lineRule="auto"/>
-              <w:jc w:val="left"/>
-              <w:rPr>
-                <w:rFonts w:hint="default" w:ascii="Arial" w:hAnsi="Arial" w:cs="Arial"/>
-              </w:rPr>
-            </w:pPr>
-            <w:r>
-              <w:rPr>
-                <w:rFonts w:hint="default" w:ascii="Arial" w:hAnsi="Arial" w:cs="Arial"/>
-              </w:rPr>
-              <w:t>pH_max</w:t>
+            <w:r>
+              <w:t>water_level</w:t>
             </w:r>
           </w:p>
         </w:tc>
@@ -7347,39 +7116,17 @@
             <w:tcW w:w="1350" w:type="dxa"/>
           </w:tcPr>
           <w:p>
-            <w:pPr>
-              <w:widowControl w:val="0"/>
-              <w:spacing w:after="0" w:line="240" w:lineRule="auto"/>
-              <w:jc w:val="left"/>
-              <w:rPr>
-                <w:rFonts w:hint="default" w:ascii="Arial" w:hAnsi="Arial" w:cs="Arial"/>
-              </w:rPr>
-            </w:pPr>
-            <w:r>
-              <w:rPr>
-                <w:rFonts w:hint="default" w:ascii="Arial" w:hAnsi="Arial" w:cs="Arial"/>
-              </w:rPr>
-              <w:t>decimal(5,2)</w:t>
-            </w:r>
-          </w:p>
-        </w:tc>
-        <w:tc>
-          <w:tcPr>
-            <w:tcW w:w="1656" w:type="dxa"/>
-          </w:tcPr>
-          <w:p>
-            <w:pPr>
-              <w:widowControl w:val="0"/>
-              <w:spacing w:after="0" w:line="240" w:lineRule="auto"/>
-              <w:jc w:val="left"/>
-              <w:rPr>
-                <w:rFonts w:hint="default" w:ascii="Arial" w:hAnsi="Arial" w:cs="Arial"/>
-              </w:rPr>
-            </w:pPr>
-            <w:r>
-              <w:rPr>
-                <w:rFonts w:hint="default" w:ascii="Arial" w:hAnsi="Arial" w:cs="Arial"/>
-              </w:rPr>
+            <w:r>
+              <w:t>decimal(6,2)</w:t>
+            </w:r>
+          </w:p>
+        </w:tc>
+        <w:tc>
+          <w:tcPr>
+            <w:tcW w:w="1656" w:type="dxa"/>
+          </w:tcPr>
+          <w:p>
+            <w:r>
               <w:t>Optional</w:t>
             </w:r>
           </w:p>
@@ -7389,19 +7136,8 @@
             <w:tcW w:w="1656" w:type="dxa"/>
           </w:tcPr>
           <w:p>
-            <w:pPr>
-              <w:widowControl w:val="0"/>
-              <w:spacing w:after="0" w:line="240" w:lineRule="auto"/>
-              <w:jc w:val="left"/>
-              <w:rPr>
-                <w:rFonts w:hint="default" w:ascii="Arial" w:hAnsi="Arial" w:cs="Arial"/>
-              </w:rPr>
-            </w:pPr>
-            <w:r>
-              <w:rPr>
-                <w:rFonts w:hint="default" w:ascii="Arial" w:hAnsi="Arial" w:cs="Arial"/>
-              </w:rPr>
-              <w:t>8</w:t>
+            <w:r>
+              <w:t>18.20</w:t>
             </w:r>
           </w:p>
         </w:tc>
@@ -7410,19 +7146,8 @@
             <w:tcW w:w="2808" w:type="dxa"/>
           </w:tcPr>
           <w:p>
-            <w:pPr>
-              <w:widowControl w:val="0"/>
-              <w:spacing w:after="0" w:line="240" w:lineRule="auto"/>
-              <w:jc w:val="left"/>
-              <w:rPr>
-                <w:rFonts w:hint="default" w:ascii="Arial" w:hAnsi="Arial" w:cs="Arial"/>
-              </w:rPr>
-            </w:pPr>
-            <w:r>
-              <w:rPr>
-                <w:rFonts w:hint="default" w:ascii="Arial" w:hAnsi="Arial" w:cs="Arial"/>
-              </w:rPr>
-              <w:t>Records the highest pH value during the measurement interval.</w:t>
+            <w:r>
+              <w:t>Stores the mean of valid water-level readings collected during this 10-minute window, in centimeters.</w:t>
             </w:r>
           </w:p>
         </w:tc>
@@ -7452,19 +7177,8 @@
             <w:tcW w:w="1458" w:type="dxa"/>
           </w:tcPr>
           <w:p>
-            <w:pPr>
-              <w:widowControl w:val="0"/>
-              <w:spacing w:after="0" w:line="240" w:lineRule="auto"/>
-              <w:jc w:val="left"/>
-              <w:rPr>
-                <w:rFonts w:hint="default" w:ascii="Arial" w:hAnsi="Arial" w:cs="Arial"/>
-              </w:rPr>
-            </w:pPr>
-            <w:r>
-              <w:rPr>
-                <w:rFonts w:hint="default" w:ascii="Arial" w:hAnsi="Arial" w:cs="Arial"/>
-              </w:rPr>
-              <w:t>pH_avg</w:t>
+            <w:r>
+              <w:t>feed_level</w:t>
             </w:r>
           </w:p>
         </w:tc>
@@ -7473,39 +7187,17 @@
             <w:tcW w:w="1350" w:type="dxa"/>
           </w:tcPr>
           <w:p>
-            <w:pPr>
-              <w:widowControl w:val="0"/>
-              <w:spacing w:after="0" w:line="240" w:lineRule="auto"/>
-              <w:jc w:val="left"/>
-              <w:rPr>
-                <w:rFonts w:hint="default" w:ascii="Arial" w:hAnsi="Arial" w:cs="Arial"/>
-              </w:rPr>
-            </w:pPr>
-            <w:r>
-              <w:rPr>
-                <w:rFonts w:hint="default" w:ascii="Arial" w:hAnsi="Arial" w:cs="Arial"/>
-              </w:rPr>
-              <w:t>decimal(5,2)</w:t>
-            </w:r>
-          </w:p>
-        </w:tc>
-        <w:tc>
-          <w:tcPr>
-            <w:tcW w:w="1656" w:type="dxa"/>
-          </w:tcPr>
-          <w:p>
-            <w:pPr>
-              <w:widowControl w:val="0"/>
-              <w:spacing w:after="0" w:line="240" w:lineRule="auto"/>
-              <w:jc w:val="left"/>
-              <w:rPr>
-                <w:rFonts w:hint="default" w:ascii="Arial" w:hAnsi="Arial" w:cs="Arial"/>
-              </w:rPr>
-            </w:pPr>
-            <w:r>
-              <w:rPr>
-                <w:rFonts w:hint="default" w:ascii="Arial" w:hAnsi="Arial" w:cs="Arial"/>
-              </w:rPr>
+            <w:r>
+              <w:t>decimal(6,2)</w:t>
+            </w:r>
+          </w:p>
+        </w:tc>
+        <w:tc>
+          <w:tcPr>
+            <w:tcW w:w="1656" w:type="dxa"/>
+          </w:tcPr>
+          <w:p>
+            <w:r>
               <w:t>Optional</w:t>
             </w:r>
           </w:p>
@@ -7515,19 +7207,8 @@
             <w:tcW w:w="1656" w:type="dxa"/>
           </w:tcPr>
           <w:p>
-            <w:pPr>
-              <w:widowControl w:val="0"/>
-              <w:spacing w:after="0" w:line="240" w:lineRule="auto"/>
-              <w:jc w:val="left"/>
-              <w:rPr>
-                <w:rFonts w:hint="default" w:ascii="Arial" w:hAnsi="Arial" w:cs="Arial"/>
-              </w:rPr>
-            </w:pPr>
-            <w:r>
-              <w:rPr>
-                <w:rFonts w:hint="default" w:ascii="Arial" w:hAnsi="Arial" w:cs="Arial"/>
-              </w:rPr>
-              <w:t>7</w:t>
+            <w:r>
+              <w:t>68.20</w:t>
             </w:r>
           </w:p>
         </w:tc>
@@ -7536,19 +7217,8 @@
             <w:tcW w:w="2808" w:type="dxa"/>
           </w:tcPr>
           <w:p>
-            <w:pPr>
-              <w:widowControl w:val="0"/>
-              <w:spacing w:after="0" w:line="240" w:lineRule="auto"/>
-              <w:jc w:val="left"/>
-              <w:rPr>
-                <w:rFonts w:hint="default" w:ascii="Arial" w:hAnsi="Arial" w:cs="Arial"/>
-              </w:rPr>
-            </w:pPr>
-            <w:r>
-              <w:rPr>
-                <w:rFonts w:hint="default" w:ascii="Arial" w:hAnsi="Arial" w:cs="Arial"/>
-              </w:rPr>
-              <w:t>Records the average pH value during the measurement interval.</w:t>
+            <w:r>
+              <w:t>Stores the mean of valid feeder-level readings collected during this 10-minute window, as a percentage.</w:t>
             </w:r>
           </w:p>
         </w:tc>
@@ -7578,19 +7248,8 @@
             <w:tcW w:w="1458" w:type="dxa"/>
           </w:tcPr>
           <w:p>
-            <w:pPr>
-              <w:widowControl w:val="0"/>
-              <w:spacing w:after="0" w:line="240" w:lineRule="auto"/>
-              <w:jc w:val="left"/>
-              <w:rPr>
-                <w:rFonts w:hint="default" w:ascii="Arial" w:hAnsi="Arial" w:cs="Arial"/>
-              </w:rPr>
-            </w:pPr>
-            <w:r>
-              <w:rPr>
-                <w:rFonts w:hint="default" w:ascii="Arial" w:hAnsi="Arial" w:cs="Arial"/>
-              </w:rPr>
-              <w:t>DO_min</w:t>
+            <w:r>
+              <w:t>recorded_at</w:t>
             </w:r>
           </w:p>
         </w:tc>
@@ -7599,61 +7258,28 @@
             <w:tcW w:w="1350" w:type="dxa"/>
           </w:tcPr>
           <w:p>
-            <w:pPr>
-              <w:widowControl w:val="0"/>
-              <w:spacing w:after="0" w:line="240" w:lineRule="auto"/>
-              <w:jc w:val="left"/>
-              <w:rPr>
-                <w:rFonts w:hint="default" w:ascii="Arial" w:hAnsi="Arial" w:cs="Arial"/>
-              </w:rPr>
-            </w:pPr>
-            <w:r>
-              <w:rPr>
-                <w:rFonts w:hint="default" w:ascii="Arial" w:hAnsi="Arial" w:cs="Arial"/>
-              </w:rPr>
-              <w:t>decimal(5,2)</w:t>
-            </w:r>
-          </w:p>
-        </w:tc>
-        <w:tc>
-          <w:tcPr>
-            <w:tcW w:w="1656" w:type="dxa"/>
-          </w:tcPr>
-          <w:p>
-            <w:pPr>
-              <w:widowControl w:val="0"/>
-              <w:spacing w:after="0" w:line="240" w:lineRule="auto"/>
-              <w:jc w:val="left"/>
-              <w:rPr>
-                <w:rFonts w:hint="default" w:ascii="Arial" w:hAnsi="Arial" w:cs="Arial"/>
-              </w:rPr>
-            </w:pPr>
-            <w:r>
-              <w:rPr>
-                <w:rFonts w:hint="default" w:ascii="Arial" w:hAnsi="Arial" w:cs="Arial"/>
-              </w:rPr>
-              <w:t>Optional</w:t>
-            </w:r>
-          </w:p>
-        </w:tc>
-        <w:tc>
-          <w:tcPr>
-            <w:tcW w:w="1656" w:type="dxa"/>
-          </w:tcPr>
-          <w:p>
-            <w:pPr>
-              <w:widowControl w:val="0"/>
-              <w:spacing w:after="0" w:line="240" w:lineRule="auto"/>
-              <w:jc w:val="left"/>
-              <w:rPr>
-                <w:rFonts w:hint="default" w:ascii="Arial" w:hAnsi="Arial" w:cs="Arial"/>
-              </w:rPr>
-            </w:pPr>
-            <w:r>
-              <w:rPr>
-                <w:rFonts w:hint="default" w:ascii="Arial" w:hAnsi="Arial" w:cs="Arial"/>
-              </w:rPr>
-              <w:t>5</w:t>
+            <w:r>
+              <w:t>timestamp</w:t>
+            </w:r>
+          </w:p>
+        </w:tc>
+        <w:tc>
+          <w:tcPr>
+            <w:tcW w:w="1656" w:type="dxa"/>
+          </w:tcPr>
+          <w:p>
+            <w:r>
+              <w:t>NOT NULL</w:t>
+            </w:r>
+          </w:p>
+        </w:tc>
+        <w:tc>
+          <w:tcPr>
+            <w:tcW w:w="1656" w:type="dxa"/>
+          </w:tcPr>
+          <w:p>
+            <w:r>
+              <w:t>2026-09-06 08:00:00</w:t>
             </w:r>
           </w:p>
         </w:tc>
@@ -7662,1027 +7288,8 @@
             <w:tcW w:w="2808" w:type="dxa"/>
           </w:tcPr>
           <w:p>
-            <w:pPr>
-              <w:widowControl w:val="0"/>
-              <w:spacing w:after="0" w:line="240" w:lineRule="auto"/>
-              <w:jc w:val="left"/>
-              <w:rPr>
-                <w:rFonts w:hint="default" w:ascii="Arial" w:hAnsi="Arial" w:cs="Arial"/>
-              </w:rPr>
-            </w:pPr>
-            <w:r>
-              <w:rPr>
-                <w:rFonts w:hint="default" w:ascii="Arial" w:hAnsi="Arial" w:cs="Arial"/>
-              </w:rPr>
-              <w:t>Records the lowest dissolved oxygen concentration in milligrams per liter during the measurement interval.</w:t>
-            </w:r>
-          </w:p>
-        </w:tc>
-      </w:tr>
-      <w:tr>
-        <w:tblPrEx>
-          <w:tblBorders>
-            <w:top w:val="single" w:color="auto" w:sz="4" w:space="0"/>
-            <w:left w:val="single" w:color="auto" w:sz="4" w:space="0"/>
-            <w:bottom w:val="single" w:color="auto" w:sz="4" w:space="0"/>
-            <w:right w:val="single" w:color="auto" w:sz="4" w:space="0"/>
-            <w:insideH w:val="single" w:color="auto" w:sz="4" w:space="0"/>
-            <w:insideV w:val="single" w:color="auto" w:sz="4" w:space="0"/>
-          </w:tblBorders>
-          <w:tblCellMar>
-            <w:top w:w="0" w:type="dxa"/>
-            <w:left w:w="108" w:type="dxa"/>
-            <w:bottom w:w="0" w:type="dxa"/>
-            <w:right w:w="108" w:type="dxa"/>
-          </w:tblCellMar>
-        </w:tblPrEx>
-        <w:trPr>
-          <w:cantSplit/>
-        </w:trPr>
-        <w:tc>
-          <w:tcPr>
-            <w:tcW w:w="1458" w:type="dxa"/>
-          </w:tcPr>
-          <w:p>
-            <w:pPr>
-              <w:widowControl w:val="0"/>
-              <w:spacing w:after="0" w:line="240" w:lineRule="auto"/>
-              <w:jc w:val="left"/>
-              <w:rPr>
-                <w:rFonts w:hint="default" w:ascii="Arial" w:hAnsi="Arial" w:cs="Arial"/>
-              </w:rPr>
-            </w:pPr>
-            <w:r>
-              <w:rPr>
-                <w:rFonts w:hint="default" w:ascii="Arial" w:hAnsi="Arial" w:cs="Arial"/>
-              </w:rPr>
-              <w:t>DO_max</w:t>
-            </w:r>
-          </w:p>
-        </w:tc>
-        <w:tc>
-          <w:tcPr>
-            <w:tcW w:w="1350" w:type="dxa"/>
-          </w:tcPr>
-          <w:p>
-            <w:pPr>
-              <w:widowControl w:val="0"/>
-              <w:spacing w:after="0" w:line="240" w:lineRule="auto"/>
-              <w:jc w:val="left"/>
-              <w:rPr>
-                <w:rFonts w:hint="default" w:ascii="Arial" w:hAnsi="Arial" w:cs="Arial"/>
-              </w:rPr>
-            </w:pPr>
-            <w:r>
-              <w:rPr>
-                <w:rFonts w:hint="default" w:ascii="Arial" w:hAnsi="Arial" w:cs="Arial"/>
-              </w:rPr>
-              <w:t>decimal(5,2)</w:t>
-            </w:r>
-          </w:p>
-        </w:tc>
-        <w:tc>
-          <w:tcPr>
-            <w:tcW w:w="1656" w:type="dxa"/>
-          </w:tcPr>
-          <w:p>
-            <w:pPr>
-              <w:widowControl w:val="0"/>
-              <w:spacing w:after="0" w:line="240" w:lineRule="auto"/>
-              <w:jc w:val="left"/>
-              <w:rPr>
-                <w:rFonts w:hint="default" w:ascii="Arial" w:hAnsi="Arial" w:cs="Arial"/>
-              </w:rPr>
-            </w:pPr>
-            <w:r>
-              <w:rPr>
-                <w:rFonts w:hint="default" w:ascii="Arial" w:hAnsi="Arial" w:cs="Arial"/>
-              </w:rPr>
-              <w:t>Optional</w:t>
-            </w:r>
-          </w:p>
-        </w:tc>
-        <w:tc>
-          <w:tcPr>
-            <w:tcW w:w="1656" w:type="dxa"/>
-          </w:tcPr>
-          <w:p>
-            <w:pPr>
-              <w:widowControl w:val="0"/>
-              <w:spacing w:after="0" w:line="240" w:lineRule="auto"/>
-              <w:jc w:val="left"/>
-              <w:rPr>
-                <w:rFonts w:hint="default" w:ascii="Arial" w:hAnsi="Arial" w:cs="Arial"/>
-              </w:rPr>
-            </w:pPr>
-            <w:r>
-              <w:rPr>
-                <w:rFonts w:hint="default" w:ascii="Arial" w:hAnsi="Arial" w:cs="Arial"/>
-              </w:rPr>
-              <w:t>6</w:t>
-            </w:r>
-          </w:p>
-        </w:tc>
-        <w:tc>
-          <w:tcPr>
-            <w:tcW w:w="2808" w:type="dxa"/>
-          </w:tcPr>
-          <w:p>
-            <w:pPr>
-              <w:widowControl w:val="0"/>
-              <w:spacing w:after="0" w:line="240" w:lineRule="auto"/>
-              <w:jc w:val="left"/>
-              <w:rPr>
-                <w:rFonts w:hint="default" w:ascii="Arial" w:hAnsi="Arial" w:cs="Arial"/>
-              </w:rPr>
-            </w:pPr>
-            <w:r>
-              <w:rPr>
-                <w:rFonts w:hint="default" w:ascii="Arial" w:hAnsi="Arial" w:cs="Arial"/>
-              </w:rPr>
-              <w:t>Records the highest dissolved oxygen concentration in milligrams per liter during the measurement interval.</w:t>
-            </w:r>
-          </w:p>
-        </w:tc>
-      </w:tr>
-      <w:tr>
-        <w:tblPrEx>
-          <w:tblBorders>
-            <w:top w:val="single" w:color="auto" w:sz="4" w:space="0"/>
-            <w:left w:val="single" w:color="auto" w:sz="4" w:space="0"/>
-            <w:bottom w:val="single" w:color="auto" w:sz="4" w:space="0"/>
-            <w:right w:val="single" w:color="auto" w:sz="4" w:space="0"/>
-            <w:insideH w:val="single" w:color="auto" w:sz="4" w:space="0"/>
-            <w:insideV w:val="single" w:color="auto" w:sz="4" w:space="0"/>
-          </w:tblBorders>
-          <w:tblCellMar>
-            <w:top w:w="0" w:type="dxa"/>
-            <w:left w:w="108" w:type="dxa"/>
-            <w:bottom w:w="0" w:type="dxa"/>
-            <w:right w:w="108" w:type="dxa"/>
-          </w:tblCellMar>
-        </w:tblPrEx>
-        <w:trPr>
-          <w:cantSplit/>
-        </w:trPr>
-        <w:tc>
-          <w:tcPr>
-            <w:tcW w:w="1458" w:type="dxa"/>
-          </w:tcPr>
-          <w:p>
-            <w:pPr>
-              <w:widowControl w:val="0"/>
-              <w:spacing w:after="0" w:line="240" w:lineRule="auto"/>
-              <w:jc w:val="left"/>
-              <w:rPr>
-                <w:rFonts w:hint="default" w:ascii="Arial" w:hAnsi="Arial" w:cs="Arial"/>
-              </w:rPr>
-            </w:pPr>
-            <w:r>
-              <w:rPr>
-                <w:rFonts w:hint="default" w:ascii="Arial" w:hAnsi="Arial" w:cs="Arial"/>
-              </w:rPr>
-              <w:t>DO_avg</w:t>
-            </w:r>
-          </w:p>
-        </w:tc>
-        <w:tc>
-          <w:tcPr>
-            <w:tcW w:w="1350" w:type="dxa"/>
-          </w:tcPr>
-          <w:p>
-            <w:pPr>
-              <w:widowControl w:val="0"/>
-              <w:spacing w:after="0" w:line="240" w:lineRule="auto"/>
-              <w:jc w:val="left"/>
-              <w:rPr>
-                <w:rFonts w:hint="default" w:ascii="Arial" w:hAnsi="Arial" w:cs="Arial"/>
-              </w:rPr>
-            </w:pPr>
-            <w:r>
-              <w:rPr>
-                <w:rFonts w:hint="default" w:ascii="Arial" w:hAnsi="Arial" w:cs="Arial"/>
-              </w:rPr>
-              <w:t>decimal(5,2)</w:t>
-            </w:r>
-          </w:p>
-        </w:tc>
-        <w:tc>
-          <w:tcPr>
-            <w:tcW w:w="1656" w:type="dxa"/>
-          </w:tcPr>
-          <w:p>
-            <w:pPr>
-              <w:widowControl w:val="0"/>
-              <w:spacing w:after="0" w:line="240" w:lineRule="auto"/>
-              <w:jc w:val="left"/>
-              <w:rPr>
-                <w:rFonts w:hint="default" w:ascii="Arial" w:hAnsi="Arial" w:cs="Arial"/>
-              </w:rPr>
-            </w:pPr>
-            <w:r>
-              <w:rPr>
-                <w:rFonts w:hint="default" w:ascii="Arial" w:hAnsi="Arial" w:cs="Arial"/>
-              </w:rPr>
-              <w:t>Optional</w:t>
-            </w:r>
-          </w:p>
-        </w:tc>
-        <w:tc>
-          <w:tcPr>
-            <w:tcW w:w="1656" w:type="dxa"/>
-          </w:tcPr>
-          <w:p>
-            <w:pPr>
-              <w:widowControl w:val="0"/>
-              <w:spacing w:after="0" w:line="240" w:lineRule="auto"/>
-              <w:jc w:val="left"/>
-              <w:rPr>
-                <w:rFonts w:hint="default" w:ascii="Arial" w:hAnsi="Arial" w:cs="Arial"/>
-              </w:rPr>
-            </w:pPr>
-            <w:r>
-              <w:rPr>
-                <w:rFonts w:hint="default" w:ascii="Arial" w:hAnsi="Arial" w:cs="Arial"/>
-              </w:rPr>
-              <w:t>5</w:t>
-            </w:r>
-          </w:p>
-        </w:tc>
-        <w:tc>
-          <w:tcPr>
-            <w:tcW w:w="2808" w:type="dxa"/>
-          </w:tcPr>
-          <w:p>
-            <w:pPr>
-              <w:widowControl w:val="0"/>
-              <w:spacing w:after="0" w:line="240" w:lineRule="auto"/>
-              <w:jc w:val="left"/>
-              <w:rPr>
-                <w:rFonts w:hint="default" w:ascii="Arial" w:hAnsi="Arial" w:cs="Arial"/>
-              </w:rPr>
-            </w:pPr>
-            <w:r>
-              <w:rPr>
-                <w:rFonts w:hint="default" w:ascii="Arial" w:hAnsi="Arial" w:cs="Arial"/>
-              </w:rPr>
-              <w:t>Records the average dissolved oxygen concentration in milligrams per liter during the measurement interval.</w:t>
-            </w:r>
-          </w:p>
-        </w:tc>
-      </w:tr>
-      <w:tr>
-        <w:tblPrEx>
-          <w:tblBorders>
-            <w:top w:val="single" w:color="auto" w:sz="4" w:space="0"/>
-            <w:left w:val="single" w:color="auto" w:sz="4" w:space="0"/>
-            <w:bottom w:val="single" w:color="auto" w:sz="4" w:space="0"/>
-            <w:right w:val="single" w:color="auto" w:sz="4" w:space="0"/>
-            <w:insideH w:val="single" w:color="auto" w:sz="4" w:space="0"/>
-            <w:insideV w:val="single" w:color="auto" w:sz="4" w:space="0"/>
-          </w:tblBorders>
-          <w:tblCellMar>
-            <w:top w:w="0" w:type="dxa"/>
-            <w:left w:w="108" w:type="dxa"/>
-            <w:bottom w:w="0" w:type="dxa"/>
-            <w:right w:w="108" w:type="dxa"/>
-          </w:tblCellMar>
-        </w:tblPrEx>
-        <w:trPr>
-          <w:cantSplit/>
-        </w:trPr>
-        <w:tc>
-          <w:tcPr>
-            <w:tcW w:w="1458" w:type="dxa"/>
-          </w:tcPr>
-          <w:p>
-            <w:pPr>
-              <w:widowControl w:val="0"/>
-              <w:spacing w:after="0" w:line="240" w:lineRule="auto"/>
-              <w:jc w:val="left"/>
-              <w:rPr>
-                <w:rFonts w:hint="default" w:ascii="Arial" w:hAnsi="Arial" w:cs="Arial"/>
-              </w:rPr>
-            </w:pPr>
-            <w:r>
-              <w:rPr>
-                <w:rFonts w:hint="default" w:ascii="Arial" w:hAnsi="Arial" w:cs="Arial"/>
-              </w:rPr>
-              <w:t>turbidity_min</w:t>
-            </w:r>
-          </w:p>
-        </w:tc>
-        <w:tc>
-          <w:tcPr>
-            <w:tcW w:w="1350" w:type="dxa"/>
-          </w:tcPr>
-          <w:p>
-            <w:pPr>
-              <w:widowControl w:val="0"/>
-              <w:spacing w:after="0" w:line="240" w:lineRule="auto"/>
-              <w:jc w:val="left"/>
-              <w:rPr>
-                <w:rFonts w:hint="default" w:ascii="Arial" w:hAnsi="Arial" w:cs="Arial"/>
-              </w:rPr>
-            </w:pPr>
-            <w:r>
-              <w:rPr>
-                <w:rFonts w:hint="default" w:ascii="Arial" w:hAnsi="Arial" w:cs="Arial"/>
-              </w:rPr>
-              <w:t>decimal(8,2)</w:t>
-            </w:r>
-          </w:p>
-        </w:tc>
-        <w:tc>
-          <w:tcPr>
-            <w:tcW w:w="1656" w:type="dxa"/>
-          </w:tcPr>
-          <w:p>
-            <w:pPr>
-              <w:widowControl w:val="0"/>
-              <w:spacing w:after="0" w:line="240" w:lineRule="auto"/>
-              <w:jc w:val="left"/>
-              <w:rPr>
-                <w:rFonts w:hint="default" w:ascii="Arial" w:hAnsi="Arial" w:cs="Arial"/>
-              </w:rPr>
-            </w:pPr>
-            <w:r>
-              <w:rPr>
-                <w:rFonts w:hint="default" w:ascii="Arial" w:hAnsi="Arial" w:cs="Arial"/>
-              </w:rPr>
-              <w:t>Optional</w:t>
-            </w:r>
-          </w:p>
-        </w:tc>
-        <w:tc>
-          <w:tcPr>
-            <w:tcW w:w="1656" w:type="dxa"/>
-          </w:tcPr>
-          <w:p>
-            <w:pPr>
-              <w:widowControl w:val="0"/>
-              <w:spacing w:after="0" w:line="240" w:lineRule="auto"/>
-              <w:jc w:val="left"/>
-              <w:rPr>
-                <w:rFonts w:hint="default" w:ascii="Arial" w:hAnsi="Arial" w:cs="Arial"/>
-              </w:rPr>
-            </w:pPr>
-            <w:r>
-              <w:rPr>
-                <w:rFonts w:hint="default" w:ascii="Arial" w:hAnsi="Arial" w:cs="Arial"/>
-              </w:rPr>
-              <w:t>20</w:t>
-            </w:r>
-          </w:p>
-        </w:tc>
-        <w:tc>
-          <w:tcPr>
-            <w:tcW w:w="2808" w:type="dxa"/>
-          </w:tcPr>
-          <w:p>
-            <w:pPr>
-              <w:widowControl w:val="0"/>
-              <w:spacing w:after="0" w:line="240" w:lineRule="auto"/>
-              <w:jc w:val="left"/>
-              <w:rPr>
-                <w:rFonts w:hint="default" w:ascii="Arial" w:hAnsi="Arial" w:cs="Arial"/>
-              </w:rPr>
-            </w:pPr>
-            <w:r>
-              <w:rPr>
-                <w:rFonts w:hint="default" w:ascii="Arial" w:hAnsi="Arial" w:cs="Arial"/>
-              </w:rPr>
-              <w:t>Records the lowest turbidity in NTU during the measurement interval.</w:t>
-            </w:r>
-          </w:p>
-        </w:tc>
-      </w:tr>
-      <w:tr>
-        <w:tblPrEx>
-          <w:tblBorders>
-            <w:top w:val="single" w:color="auto" w:sz="4" w:space="0"/>
-            <w:left w:val="single" w:color="auto" w:sz="4" w:space="0"/>
-            <w:bottom w:val="single" w:color="auto" w:sz="4" w:space="0"/>
-            <w:right w:val="single" w:color="auto" w:sz="4" w:space="0"/>
-            <w:insideH w:val="single" w:color="auto" w:sz="4" w:space="0"/>
-            <w:insideV w:val="single" w:color="auto" w:sz="4" w:space="0"/>
-          </w:tblBorders>
-          <w:tblCellMar>
-            <w:top w:w="0" w:type="dxa"/>
-            <w:left w:w="108" w:type="dxa"/>
-            <w:bottom w:w="0" w:type="dxa"/>
-            <w:right w:w="108" w:type="dxa"/>
-          </w:tblCellMar>
-        </w:tblPrEx>
-        <w:trPr>
-          <w:cantSplit/>
-        </w:trPr>
-        <w:tc>
-          <w:tcPr>
-            <w:tcW w:w="1458" w:type="dxa"/>
-          </w:tcPr>
-          <w:p>
-            <w:pPr>
-              <w:widowControl w:val="0"/>
-              <w:spacing w:after="0" w:line="240" w:lineRule="auto"/>
-              <w:jc w:val="left"/>
-              <w:rPr>
-                <w:rFonts w:hint="default" w:ascii="Arial" w:hAnsi="Arial" w:cs="Arial"/>
-              </w:rPr>
-            </w:pPr>
-            <w:r>
-              <w:rPr>
-                <w:rFonts w:hint="default" w:ascii="Arial" w:hAnsi="Arial" w:cs="Arial"/>
-              </w:rPr>
-              <w:t>turbidity_max</w:t>
-            </w:r>
-          </w:p>
-        </w:tc>
-        <w:tc>
-          <w:tcPr>
-            <w:tcW w:w="1350" w:type="dxa"/>
-          </w:tcPr>
-          <w:p>
-            <w:pPr>
-              <w:widowControl w:val="0"/>
-              <w:spacing w:after="0" w:line="240" w:lineRule="auto"/>
-              <w:jc w:val="left"/>
-              <w:rPr>
-                <w:rFonts w:hint="default" w:ascii="Arial" w:hAnsi="Arial" w:cs="Arial"/>
-              </w:rPr>
-            </w:pPr>
-            <w:r>
-              <w:rPr>
-                <w:rFonts w:hint="default" w:ascii="Arial" w:hAnsi="Arial" w:cs="Arial"/>
-              </w:rPr>
-              <w:t>decimal(8,2)</w:t>
-            </w:r>
-          </w:p>
-        </w:tc>
-        <w:tc>
-          <w:tcPr>
-            <w:tcW w:w="1656" w:type="dxa"/>
-          </w:tcPr>
-          <w:p>
-            <w:pPr>
-              <w:widowControl w:val="0"/>
-              <w:spacing w:after="0" w:line="240" w:lineRule="auto"/>
-              <w:jc w:val="left"/>
-              <w:rPr>
-                <w:rFonts w:hint="default" w:ascii="Arial" w:hAnsi="Arial" w:cs="Arial"/>
-              </w:rPr>
-            </w:pPr>
-            <w:r>
-              <w:rPr>
-                <w:rFonts w:hint="default" w:ascii="Arial" w:hAnsi="Arial" w:cs="Arial"/>
-              </w:rPr>
-              <w:t>Optional</w:t>
-            </w:r>
-          </w:p>
-        </w:tc>
-        <w:tc>
-          <w:tcPr>
-            <w:tcW w:w="1656" w:type="dxa"/>
-          </w:tcPr>
-          <w:p>
-            <w:pPr>
-              <w:widowControl w:val="0"/>
-              <w:spacing w:after="0" w:line="240" w:lineRule="auto"/>
-              <w:jc w:val="left"/>
-              <w:rPr>
-                <w:rFonts w:hint="default" w:ascii="Arial" w:hAnsi="Arial" w:cs="Arial"/>
-              </w:rPr>
-            </w:pPr>
-            <w:r>
-              <w:rPr>
-                <w:rFonts w:hint="default" w:ascii="Arial" w:hAnsi="Arial" w:cs="Arial"/>
-              </w:rPr>
-              <w:t>21</w:t>
-            </w:r>
-          </w:p>
-        </w:tc>
-        <w:tc>
-          <w:tcPr>
-            <w:tcW w:w="2808" w:type="dxa"/>
-          </w:tcPr>
-          <w:p>
-            <w:pPr>
-              <w:widowControl w:val="0"/>
-              <w:spacing w:after="0" w:line="240" w:lineRule="auto"/>
-              <w:jc w:val="left"/>
-              <w:rPr>
-                <w:rFonts w:hint="default" w:ascii="Arial" w:hAnsi="Arial" w:cs="Arial"/>
-              </w:rPr>
-            </w:pPr>
-            <w:r>
-              <w:rPr>
-                <w:rFonts w:hint="default" w:ascii="Arial" w:hAnsi="Arial" w:cs="Arial"/>
-              </w:rPr>
-              <w:t>Records the highest turbidity in NTU during the measurement interval.</w:t>
-            </w:r>
-          </w:p>
-        </w:tc>
-      </w:tr>
-      <w:tr>
-        <w:tblPrEx>
-          <w:tblBorders>
-            <w:top w:val="single" w:color="auto" w:sz="4" w:space="0"/>
-            <w:left w:val="single" w:color="auto" w:sz="4" w:space="0"/>
-            <w:bottom w:val="single" w:color="auto" w:sz="4" w:space="0"/>
-            <w:right w:val="single" w:color="auto" w:sz="4" w:space="0"/>
-            <w:insideH w:val="single" w:color="auto" w:sz="4" w:space="0"/>
-            <w:insideV w:val="single" w:color="auto" w:sz="4" w:space="0"/>
-          </w:tblBorders>
-          <w:tblCellMar>
-            <w:top w:w="0" w:type="dxa"/>
-            <w:left w:w="108" w:type="dxa"/>
-            <w:bottom w:w="0" w:type="dxa"/>
-            <w:right w:w="108" w:type="dxa"/>
-          </w:tblCellMar>
-        </w:tblPrEx>
-        <w:trPr>
-          <w:cantSplit/>
-        </w:trPr>
-        <w:tc>
-          <w:tcPr>
-            <w:tcW w:w="1458" w:type="dxa"/>
-          </w:tcPr>
-          <w:p>
-            <w:pPr>
-              <w:widowControl w:val="0"/>
-              <w:spacing w:after="0" w:line="240" w:lineRule="auto"/>
-              <w:jc w:val="left"/>
-              <w:rPr>
-                <w:rFonts w:hint="default" w:ascii="Arial" w:hAnsi="Arial" w:cs="Arial"/>
-              </w:rPr>
-            </w:pPr>
-            <w:r>
-              <w:rPr>
-                <w:rFonts w:hint="default" w:ascii="Arial" w:hAnsi="Arial" w:cs="Arial"/>
-              </w:rPr>
-              <w:t>turbidity_avg</w:t>
-            </w:r>
-          </w:p>
-        </w:tc>
-        <w:tc>
-          <w:tcPr>
-            <w:tcW w:w="1350" w:type="dxa"/>
-          </w:tcPr>
-          <w:p>
-            <w:pPr>
-              <w:widowControl w:val="0"/>
-              <w:spacing w:after="0" w:line="240" w:lineRule="auto"/>
-              <w:jc w:val="left"/>
-              <w:rPr>
-                <w:rFonts w:hint="default" w:ascii="Arial" w:hAnsi="Arial" w:cs="Arial"/>
-              </w:rPr>
-            </w:pPr>
-            <w:r>
-              <w:rPr>
-                <w:rFonts w:hint="default" w:ascii="Arial" w:hAnsi="Arial" w:cs="Arial"/>
-              </w:rPr>
-              <w:t>decimal(8,2)</w:t>
-            </w:r>
-          </w:p>
-        </w:tc>
-        <w:tc>
-          <w:tcPr>
-            <w:tcW w:w="1656" w:type="dxa"/>
-          </w:tcPr>
-          <w:p>
-            <w:pPr>
-              <w:widowControl w:val="0"/>
-              <w:spacing w:after="0" w:line="240" w:lineRule="auto"/>
-              <w:jc w:val="left"/>
-              <w:rPr>
-                <w:rFonts w:hint="default" w:ascii="Arial" w:hAnsi="Arial" w:cs="Arial"/>
-              </w:rPr>
-            </w:pPr>
-            <w:r>
-              <w:rPr>
-                <w:rFonts w:hint="default" w:ascii="Arial" w:hAnsi="Arial" w:cs="Arial"/>
-              </w:rPr>
-              <w:t>Optional</w:t>
-            </w:r>
-          </w:p>
-        </w:tc>
-        <w:tc>
-          <w:tcPr>
-            <w:tcW w:w="1656" w:type="dxa"/>
-          </w:tcPr>
-          <w:p>
-            <w:pPr>
-              <w:widowControl w:val="0"/>
-              <w:spacing w:after="0" w:line="240" w:lineRule="auto"/>
-              <w:jc w:val="left"/>
-              <w:rPr>
-                <w:rFonts w:hint="default" w:ascii="Arial" w:hAnsi="Arial" w:cs="Arial"/>
-              </w:rPr>
-            </w:pPr>
-            <w:r>
-              <w:rPr>
-                <w:rFonts w:hint="default" w:ascii="Arial" w:hAnsi="Arial" w:cs="Arial"/>
-              </w:rPr>
-              <w:t>20</w:t>
-            </w:r>
-          </w:p>
-        </w:tc>
-        <w:tc>
-          <w:tcPr>
-            <w:tcW w:w="2808" w:type="dxa"/>
-          </w:tcPr>
-          <w:p>
-            <w:pPr>
-              <w:widowControl w:val="0"/>
-              <w:spacing w:after="0" w:line="240" w:lineRule="auto"/>
-              <w:jc w:val="left"/>
-              <w:rPr>
-                <w:rFonts w:hint="default" w:ascii="Arial" w:hAnsi="Arial" w:cs="Arial"/>
-              </w:rPr>
-            </w:pPr>
-            <w:r>
-              <w:rPr>
-                <w:rFonts w:hint="default" w:ascii="Arial" w:hAnsi="Arial" w:cs="Arial"/>
-              </w:rPr>
-              <w:t>Records the average turbidity in NTU during the measurement interval.</w:t>
-            </w:r>
-          </w:p>
-        </w:tc>
-      </w:tr>
-      <w:tr>
-        <w:tblPrEx>
-          <w:tblBorders>
-            <w:top w:val="single" w:color="auto" w:sz="4" w:space="0"/>
-            <w:left w:val="single" w:color="auto" w:sz="4" w:space="0"/>
-            <w:bottom w:val="single" w:color="auto" w:sz="4" w:space="0"/>
-            <w:right w:val="single" w:color="auto" w:sz="4" w:space="0"/>
-            <w:insideH w:val="single" w:color="auto" w:sz="4" w:space="0"/>
-            <w:insideV w:val="single" w:color="auto" w:sz="4" w:space="0"/>
-          </w:tblBorders>
-          <w:tblCellMar>
-            <w:top w:w="0" w:type="dxa"/>
-            <w:left w:w="108" w:type="dxa"/>
-            <w:bottom w:w="0" w:type="dxa"/>
-            <w:right w:w="108" w:type="dxa"/>
-          </w:tblCellMar>
-        </w:tblPrEx>
-        <w:trPr>
-          <w:cantSplit/>
-        </w:trPr>
-        <w:tc>
-          <w:tcPr>
-            <w:tcW w:w="1458" w:type="dxa"/>
-          </w:tcPr>
-          <w:p>
-            <w:pPr>
-              <w:widowControl w:val="0"/>
-              <w:spacing w:after="0" w:line="240" w:lineRule="auto"/>
-              <w:jc w:val="left"/>
-              <w:rPr>
-                <w:rFonts w:hint="default" w:ascii="Arial" w:hAnsi="Arial" w:cs="Arial"/>
-              </w:rPr>
-            </w:pPr>
-            <w:r>
-              <w:rPr>
-                <w:rFonts w:hint="default" w:ascii="Arial" w:hAnsi="Arial" w:cs="Arial"/>
-              </w:rPr>
-              <w:t>water_level</w:t>
-            </w:r>
-          </w:p>
-        </w:tc>
-        <w:tc>
-          <w:tcPr>
-            <w:tcW w:w="1350" w:type="dxa"/>
-          </w:tcPr>
-          <w:p>
-            <w:pPr>
-              <w:widowControl w:val="0"/>
-              <w:spacing w:after="0" w:line="240" w:lineRule="auto"/>
-              <w:jc w:val="left"/>
-              <w:rPr>
-                <w:rFonts w:hint="default" w:ascii="Arial" w:hAnsi="Arial" w:cs="Arial"/>
-              </w:rPr>
-            </w:pPr>
-            <w:r>
-              <w:rPr>
-                <w:rFonts w:hint="default" w:ascii="Arial" w:hAnsi="Arial" w:cs="Arial"/>
-              </w:rPr>
-              <w:t>decimal(6,2)</w:t>
-            </w:r>
-          </w:p>
-        </w:tc>
-        <w:tc>
-          <w:tcPr>
-            <w:tcW w:w="1656" w:type="dxa"/>
-          </w:tcPr>
-          <w:p>
-            <w:pPr>
-              <w:widowControl w:val="0"/>
-              <w:spacing w:after="0" w:line="240" w:lineRule="auto"/>
-              <w:jc w:val="left"/>
-              <w:rPr>
-                <w:rFonts w:hint="default" w:ascii="Arial" w:hAnsi="Arial" w:cs="Arial"/>
-              </w:rPr>
-            </w:pPr>
-            <w:r>
-              <w:rPr>
-                <w:rFonts w:hint="default" w:ascii="Arial" w:hAnsi="Arial" w:cs="Arial"/>
-              </w:rPr>
-              <w:t>Optional</w:t>
-            </w:r>
-          </w:p>
-        </w:tc>
-        <w:tc>
-          <w:tcPr>
-            <w:tcW w:w="1656" w:type="dxa"/>
-          </w:tcPr>
-          <w:p>
-            <w:pPr>
-              <w:widowControl w:val="0"/>
-              <w:spacing w:after="0" w:line="240" w:lineRule="auto"/>
-              <w:jc w:val="left"/>
-              <w:rPr>
-                <w:rFonts w:hint="default" w:ascii="Arial" w:hAnsi="Arial" w:cs="Arial"/>
-              </w:rPr>
-            </w:pPr>
-            <w:r>
-              <w:rPr>
-                <w:rFonts w:hint="default" w:ascii="Arial" w:hAnsi="Arial" w:cs="Arial"/>
-              </w:rPr>
-              <w:t>18.00</w:t>
-            </w:r>
-          </w:p>
-        </w:tc>
-        <w:tc>
-          <w:tcPr>
-            <w:tcW w:w="2808" w:type="dxa"/>
-          </w:tcPr>
-          <w:p>
-            <w:pPr>
-              <w:widowControl w:val="0"/>
-              <w:spacing w:after="0" w:line="240" w:lineRule="auto"/>
-              <w:jc w:val="left"/>
-              <w:rPr>
-                <w:rFonts w:hint="default" w:ascii="Arial" w:hAnsi="Arial" w:cs="Arial"/>
-              </w:rPr>
-            </w:pPr>
-            <w:r>
-              <w:rPr>
-                <w:rFonts w:hint="default" w:ascii="Arial" w:hAnsi="Arial" w:cs="Arial"/>
-              </w:rPr>
-              <w:t>Records the single water-depth value in centimeters for this history interval; water level has no interval min/max/average fields.</w:t>
-            </w:r>
-          </w:p>
-        </w:tc>
-      </w:tr>
-      <w:tr>
-        <w:tblPrEx>
-          <w:tblBorders>
-            <w:top w:val="single" w:color="auto" w:sz="4" w:space="0"/>
-            <w:left w:val="single" w:color="auto" w:sz="4" w:space="0"/>
-            <w:bottom w:val="single" w:color="auto" w:sz="4" w:space="0"/>
-            <w:right w:val="single" w:color="auto" w:sz="4" w:space="0"/>
-            <w:insideH w:val="single" w:color="auto" w:sz="4" w:space="0"/>
-            <w:insideV w:val="single" w:color="auto" w:sz="4" w:space="0"/>
-          </w:tblBorders>
-          <w:tblCellMar>
-            <w:top w:w="0" w:type="dxa"/>
-            <w:left w:w="108" w:type="dxa"/>
-            <w:bottom w:w="0" w:type="dxa"/>
-            <w:right w:w="108" w:type="dxa"/>
-          </w:tblCellMar>
-        </w:tblPrEx>
-        <w:trPr>
-          <w:cantSplit/>
-        </w:trPr>
-        <w:tc>
-          <w:tcPr>
-            <w:tcW w:w="1458" w:type="dxa"/>
-          </w:tcPr>
-          <w:p>
-            <w:pPr>
-              <w:widowControl w:val="0"/>
-              <w:spacing w:after="0" w:line="240" w:lineRule="auto"/>
-              <w:jc w:val="left"/>
-              <w:rPr>
-                <w:rFonts w:hint="default" w:ascii="Arial" w:hAnsi="Arial" w:cs="Arial"/>
-              </w:rPr>
-            </w:pPr>
-            <w:r>
-              <w:rPr>
-                <w:rFonts w:hint="default" w:ascii="Arial" w:hAnsi="Arial" w:cs="Arial"/>
-              </w:rPr>
-              <w:t>feed_level</w:t>
-            </w:r>
-          </w:p>
-        </w:tc>
-        <w:tc>
-          <w:tcPr>
-            <w:tcW w:w="1350" w:type="dxa"/>
-          </w:tcPr>
-          <w:p>
-            <w:pPr>
-              <w:widowControl w:val="0"/>
-              <w:spacing w:after="0" w:line="240" w:lineRule="auto"/>
-              <w:jc w:val="left"/>
-              <w:rPr>
-                <w:rFonts w:hint="default" w:ascii="Arial" w:hAnsi="Arial" w:cs="Arial"/>
-              </w:rPr>
-            </w:pPr>
-            <w:r>
-              <w:rPr>
-                <w:rFonts w:hint="default" w:ascii="Arial" w:hAnsi="Arial" w:cs="Arial"/>
-              </w:rPr>
-              <w:t>decimal(6,2)</w:t>
-            </w:r>
-          </w:p>
-        </w:tc>
-        <w:tc>
-          <w:tcPr>
-            <w:tcW w:w="1656" w:type="dxa"/>
-          </w:tcPr>
-          <w:p>
-            <w:pPr>
-              <w:widowControl w:val="0"/>
-              <w:spacing w:after="0" w:line="240" w:lineRule="auto"/>
-              <w:jc w:val="left"/>
-              <w:rPr>
-                <w:rFonts w:hint="default" w:ascii="Arial" w:hAnsi="Arial" w:cs="Arial"/>
-              </w:rPr>
-            </w:pPr>
-            <w:r>
-              <w:rPr>
-                <w:rFonts w:hint="default" w:ascii="Arial" w:hAnsi="Arial" w:cs="Arial"/>
-              </w:rPr>
-              <w:t>Optional</w:t>
-            </w:r>
-          </w:p>
-        </w:tc>
-        <w:tc>
-          <w:tcPr>
-            <w:tcW w:w="1656" w:type="dxa"/>
-          </w:tcPr>
-          <w:p>
-            <w:pPr>
-              <w:widowControl w:val="0"/>
-              <w:spacing w:after="0" w:line="240" w:lineRule="auto"/>
-              <w:jc w:val="left"/>
-              <w:rPr>
-                <w:rFonts w:hint="default" w:ascii="Arial" w:hAnsi="Arial" w:cs="Arial"/>
-              </w:rPr>
-            </w:pPr>
-            <w:r>
-              <w:rPr>
-                <w:rFonts w:hint="default" w:ascii="Arial" w:hAnsi="Arial" w:cs="Arial"/>
-              </w:rPr>
-              <w:t>68</w:t>
-            </w:r>
-          </w:p>
-        </w:tc>
-        <w:tc>
-          <w:tcPr>
-            <w:tcW w:w="2808" w:type="dxa"/>
-          </w:tcPr>
-          <w:p>
-            <w:pPr>
-              <w:widowControl w:val="0"/>
-              <w:spacing w:after="0" w:line="240" w:lineRule="auto"/>
-              <w:jc w:val="left"/>
-              <w:rPr>
-                <w:rFonts w:hint="default" w:ascii="Arial" w:hAnsi="Arial" w:cs="Arial"/>
-              </w:rPr>
-            </w:pPr>
-            <w:r>
-              <w:rPr>
-                <w:rFonts w:hint="default" w:ascii="Arial" w:hAnsi="Arial" w:cs="Arial"/>
-              </w:rPr>
-              <w:t>Records the hopper sensor reading as a percentage.</w:t>
-            </w:r>
-          </w:p>
-        </w:tc>
-      </w:tr>
-      <w:tr>
-        <w:tblPrEx>
-          <w:tblBorders>
-            <w:top w:val="single" w:color="auto" w:sz="4" w:space="0"/>
-            <w:left w:val="single" w:color="auto" w:sz="4" w:space="0"/>
-            <w:bottom w:val="single" w:color="auto" w:sz="4" w:space="0"/>
-            <w:right w:val="single" w:color="auto" w:sz="4" w:space="0"/>
-            <w:insideH w:val="single" w:color="auto" w:sz="4" w:space="0"/>
-            <w:insideV w:val="single" w:color="auto" w:sz="4" w:space="0"/>
-          </w:tblBorders>
-          <w:tblCellMar>
-            <w:top w:w="0" w:type="dxa"/>
-            <w:left w:w="108" w:type="dxa"/>
-            <w:bottom w:w="0" w:type="dxa"/>
-            <w:right w:w="108" w:type="dxa"/>
-          </w:tblCellMar>
-        </w:tblPrEx>
-        <w:trPr>
-          <w:cantSplit/>
-        </w:trPr>
-        <w:tc>
-          <w:tcPr>
-            <w:tcW w:w="1458" w:type="dxa"/>
-          </w:tcPr>
-          <w:p>
-            <w:pPr>
-              <w:widowControl w:val="0"/>
-              <w:spacing w:after="0" w:line="240" w:lineRule="auto"/>
-              <w:jc w:val="left"/>
-              <w:rPr>
-                <w:rFonts w:hint="default" w:ascii="Arial" w:hAnsi="Arial" w:cs="Arial"/>
-              </w:rPr>
-            </w:pPr>
-            <w:r>
-              <w:rPr>
-                <w:rFonts w:hint="default" w:ascii="Arial" w:hAnsi="Arial" w:cs="Arial"/>
-              </w:rPr>
-              <w:t>recorded_at</w:t>
-            </w:r>
-          </w:p>
-        </w:tc>
-        <w:tc>
-          <w:tcPr>
-            <w:tcW w:w="1350" w:type="dxa"/>
-          </w:tcPr>
-          <w:p>
-            <w:pPr>
-              <w:widowControl w:val="0"/>
-              <w:spacing w:after="0" w:line="240" w:lineRule="auto"/>
-              <w:jc w:val="left"/>
-              <w:rPr>
-                <w:rFonts w:hint="default" w:ascii="Arial" w:hAnsi="Arial" w:cs="Arial"/>
-              </w:rPr>
-            </w:pPr>
-            <w:r>
-              <w:rPr>
-                <w:rFonts w:hint="default" w:ascii="Arial" w:hAnsi="Arial" w:cs="Arial"/>
-              </w:rPr>
-              <w:t>timestamp</w:t>
-            </w:r>
-          </w:p>
-        </w:tc>
-        <w:tc>
-          <w:tcPr>
-            <w:tcW w:w="1656" w:type="dxa"/>
-          </w:tcPr>
-          <w:p>
-            <w:pPr>
-              <w:widowControl w:val="0"/>
-              <w:spacing w:after="0" w:line="240" w:lineRule="auto"/>
-              <w:jc w:val="left"/>
-              <w:rPr>
-                <w:rFonts w:hint="default" w:ascii="Arial" w:hAnsi="Arial" w:cs="Arial"/>
-              </w:rPr>
-            </w:pPr>
-            <w:r>
-              <w:rPr>
-                <w:rFonts w:hint="default" w:ascii="Arial" w:hAnsi="Arial" w:cs="Arial"/>
-              </w:rPr>
-              <w:t>NOT NULL</w:t>
-            </w:r>
-          </w:p>
-        </w:tc>
-        <w:tc>
-          <w:tcPr>
-            <w:tcW w:w="1656" w:type="dxa"/>
-          </w:tcPr>
-          <w:p>
-            <w:pPr>
-              <w:widowControl w:val="0"/>
-              <w:spacing w:after="0" w:line="240" w:lineRule="auto"/>
-              <w:jc w:val="left"/>
-              <w:rPr>
-                <w:rFonts w:hint="default" w:ascii="Arial" w:hAnsi="Arial" w:cs="Arial"/>
-              </w:rPr>
-            </w:pPr>
-            <w:r>
-              <w:rPr>
-                <w:rFonts w:hint="default" w:ascii="Arial" w:hAnsi="Arial" w:cs="Arial"/>
-              </w:rPr>
-              <w:t>2026-09-06 08:00:00</w:t>
-            </w:r>
-          </w:p>
-        </w:tc>
-        <w:tc>
-          <w:tcPr>
-            <w:tcW w:w="2808" w:type="dxa"/>
-          </w:tcPr>
-          <w:p>
-            <w:pPr>
-              <w:widowControl w:val="0"/>
-              <w:spacing w:after="0" w:line="240" w:lineRule="auto"/>
-              <w:jc w:val="left"/>
-              <w:rPr>
-                <w:rFonts w:hint="default" w:ascii="Arial" w:hAnsi="Arial" w:cs="Arial"/>
-              </w:rPr>
-            </w:pPr>
-            <w:r>
-              <w:rPr>
-                <w:rFonts w:hint="default" w:ascii="Arial" w:hAnsi="Arial" w:cs="Arial"/>
-              </w:rPr>
-              <w:t>Records when the ESP32 collected the sensor reading.</w:t>
+            <w:r>
+              <w:t>Records the timestamp assigned to this 10-minute history entry.</w:t>
             </w:r>
           </w:p>
         </w:tc>

</xml_diff>

<commit_message>
Clarify sensor threshold min and max fields
</commit_message>
<xml_diff>
--- a/docs/Deliverables/Data Dictionary.docx
+++ b/docs/Deliverables/Data Dictionary.docx
@@ -5832,7 +5832,7 @@
               <w:rPr>
                 <w:rFonts w:hint="default" w:ascii="Arial" w:hAnsi="Arial" w:cs="Arial"/>
               </w:rPr>
-              <w:t>20</w:t>
+              <w:t>Sensor-specific configured value</w:t>
             </w:r>
           </w:p>
         </w:tc>
@@ -5852,7 +5852,7 @@
               <w:rPr>
                 <w:rFonts w:hint="default" w:ascii="Arial" w:hAnsi="Arial" w:cs="Arial"/>
               </w:rPr>
-              <w:t>Lower range bound for temperature, pH, dissolved oxygen, or turbidity. Not used for water_level or feed_level.</w:t>
+              <w:t>Configured lower threshold for temperature, pH, dissolved oxygen, or turbidity; not a minimum reading captured within a 10-minute window. Not used for water_level or feed_level.</w:t>
             </w:r>
           </w:p>
         </w:tc>
@@ -5955,7 +5955,7 @@
               <w:rPr>
                 <w:rFonts w:hint="default" w:ascii="Arial" w:hAnsi="Arial" w:cs="Arial"/>
               </w:rPr>
-              <w:t>100</w:t>
+              <w:t>Sensor-specific configured value</w:t>
             </w:r>
           </w:p>
         </w:tc>
@@ -5975,7 +5975,7 @@
               <w:rPr>
                 <w:rFonts w:hint="default" w:ascii="Arial" w:hAnsi="Arial" w:cs="Arial"/>
               </w:rPr>
-              <w:t>Upper range bound for temperature, pH, dissolved oxygen, or turbidity. Not used for water_level or feed_level.</w:t>
+              <w:t>Configured upper threshold for temperature, pH, dissolved oxygen, or turbidity; not a maximum reading captured within a 10-minute window. Not used for water_level or feed_level.</w:t>
             </w:r>
           </w:p>
         </w:tc>

</xml_diff>

<commit_message>
docs(feeder): remove water quality warning field
</commit_message>
<xml_diff>
--- a/docs/Deliverables/Data Dictionary.docx
+++ b/docs/Deliverables/Data Dictionary.docx
@@ -13395,77 +13395,6 @@
             </w:pPr>
             <w:r>
               <w:t>Records when the feeder operation was logged.</w:t>
-            </w:r>
-          </w:p>
-        </w:tc>
-      </w:tr>
-      <w:tr>
-        <w:tblPrEx>
-          <w:tblBorders>
-            <w:top w:val="single" w:color="auto" w:sz="4" w:space="0"/>
-            <w:left w:val="single" w:color="auto" w:sz="4" w:space="0"/>
-            <w:bottom w:val="single" w:color="auto" w:sz="4" w:space="0"/>
-            <w:right w:val="single" w:color="auto" w:sz="4" w:space="0"/>
-            <w:insideH w:val="single" w:color="auto" w:sz="4" w:space="0"/>
-            <w:insideV w:val="single" w:color="auto" w:sz="4" w:space="0"/>
-          </w:tblBorders>
-          <w:tblCellMar>
-            <w:top w:w="0" w:type="dxa"/>
-            <w:left w:w="108" w:type="dxa"/>
-            <w:bottom w:w="0" w:type="dxa"/>
-            <w:right w:w="108" w:type="dxa"/>
-          </w:tblCellMar>
-        </w:tblPrEx>
-        <w:trPr>
-          <w:cantSplit/>
-        </w:trPr>
-        <w:tc>
-          <w:tcPr>
-            <w:tcW w:w="1458" w:type="dxa"/>
-          </w:tcPr>
-          <w:p>
-            <w:r>
-              <w:t>water_quality_warning</w:t>
-            </w:r>
-          </w:p>
-        </w:tc>
-        <w:tc>
-          <w:tcPr>
-            <w:tcW w:w="1350" w:type="dxa"/>
-          </w:tcPr>
-          <w:p>
-            <w:r>
-              <w:t>text</w:t>
-            </w:r>
-          </w:p>
-        </w:tc>
-        <w:tc>
-          <w:tcPr>
-            <w:tcW w:w="1656" w:type="dxa"/>
-          </w:tcPr>
-          <w:p>
-            <w:r>
-              <w:t>Optional</w:t>
-            </w:r>
-          </w:p>
-        </w:tc>
-        <w:tc>
-          <w:tcPr>
-            <w:tcW w:w="1656" w:type="dxa"/>
-          </w:tcPr>
-          <w:p>
-            <w:r>
-              <w:t>Temperature high: 33.0 C (max 32.0 C)</w:t>
-            </w:r>
-          </w:p>
-        </w:tc>
-        <w:tc>
-          <w:tcPr>
-            <w:tcW w:w="2808" w:type="dxa"/>
-          </w:tcPr>
-          <w:p>
-            <w:r>
-              <w:t>Records valid water-quality readings outside configured ranges during a successfully dispensed feed. It is a warning only and does not indicate that feeding was blocked.</w:t>
             </w:r>
           </w:p>
         </w:tc>

</xml_diff>